<commit_message>
Clean up backup files
</commit_message>
<xml_diff>
--- a/tajoeedo.docx
+++ b/tajoeedo.docx
@@ -8,6 +8,1538 @@
           <w:rtl/>
         </w:rPr>
       </w:pPr>
+      <w:r>
+        <w:t>standard_7c0f51e58919fda42428b37550d9b7edbcc74d30de6b56470be505ad204a82664853e8e79a6ac811aab9e2432dbf0791b7617fb639839634f1572ebf165f7110d94c09fe67d45b1e04b9c12ee5ecbc223664e3824ba2e5899ab87ebea66e9d311462e25d1835ae61b4bef7f6ef5575a50833475bd2da43ed30b18ad4625efa45</w:t>
+      </w:r>
+    </w:p>
+    <w:p>
+      <w:pPr>
+        <w:rPr>
+          <w:rtl/>
+        </w:rPr>
+      </w:pPr>
+    </w:p>
+    <w:p>
+      <w:pPr>
+        <w:rPr>
+          <w:rtl/>
+        </w:rPr>
+      </w:pPr>
+    </w:p>
+    <w:p>
+      <w:pPr>
+        <w:rPr>
+          <w:rtl/>
+        </w:rPr>
+      </w:pPr>
+    </w:p>
+    <w:p>
+      <w:pPr>
+        <w:rPr>
+          <w:rtl/>
+        </w:rPr>
+      </w:pPr>
+    </w:p>
+    <w:p>
+      <w:pPr>
+        <w:rPr>
+          <w:rtl/>
+        </w:rPr>
+      </w:pPr>
+    </w:p>
+    <w:p>
+      <w:r>
+        <w:pict w14:anchorId="6F0697A0">
+          <v:rect id="_x0000_i1031" style="width:0;height:1.5pt" o:hralign="center" o:hrstd="t" o:hr="t" fillcolor="#a0a0a0" stroked="f"/>
+        </w:pict>
+      </w:r>
+    </w:p>
+    <w:p>
+      <w:r>
+        <w:rPr>
+          <w:b/>
+          <w:bCs/>
+          <w:rtl/>
+        </w:rPr>
+        <w:t xml:space="preserve">ملخص مشروع </w:t>
+      </w:r>
+      <w:proofErr w:type="spellStart"/>
+      <w:r>
+        <w:rPr>
+          <w:b/>
+          <w:bCs/>
+          <w:rtl/>
+        </w:rPr>
+        <w:t>تجويدو</w:t>
+      </w:r>
+      <w:proofErr w:type="spellEnd"/>
+      <w:r>
+        <w:rPr>
+          <w:b/>
+          <w:bCs/>
+          <w:rtl/>
+        </w:rPr>
+        <w:t xml:space="preserve"> (للمحادثة الجديدة)</w:t>
+      </w:r>
+      <w:r>
+        <w:rPr>
+          <w:b/>
+          <w:bCs/>
+        </w:rPr>
+        <w:t>:</w:t>
+      </w:r>
+    </w:p>
+    <w:p>
+      <w:pPr>
+        <w:numPr>
+          <w:ilvl w:val="0"/>
+          <w:numId w:val="6"/>
+        </w:numPr>
+      </w:pPr>
+      <w:r>
+        <w:rPr>
+          <w:rtl/>
+        </w:rPr>
+        <w:t>تطبيق ملف</w:t>
+      </w:r>
+      <w:r>
+        <w:t xml:space="preserve"> HTML </w:t>
+      </w:r>
+      <w:r>
+        <w:rPr>
+          <w:rtl/>
+        </w:rPr>
+        <w:t>واحد</w:t>
+      </w:r>
+      <w:r>
+        <w:t xml:space="preserve"> (index.html) </w:t>
+      </w:r>
+      <w:r>
+        <w:rPr>
+          <w:rtl/>
+        </w:rPr>
+        <w:t>لتعليم القرآن والتجويد للأطفال</w:t>
+      </w:r>
+    </w:p>
+    <w:p>
+      <w:pPr>
+        <w:numPr>
+          <w:ilvl w:val="0"/>
+          <w:numId w:val="6"/>
+        </w:numPr>
+      </w:pPr>
+      <w:r>
+        <w:rPr>
+          <w:b/>
+          <w:bCs/>
+          <w:rtl/>
+        </w:rPr>
+        <w:t>الاستضافة</w:t>
+      </w:r>
+      <w:r>
+        <w:t xml:space="preserve">: </w:t>
+      </w:r>
+      <w:r>
+        <w:rPr>
+          <w:rtl/>
+        </w:rPr>
+        <w:t xml:space="preserve">منشور على </w:t>
+      </w:r>
+      <w:proofErr w:type="spellStart"/>
+      <w:r>
+        <w:t>tajweedoo.vercel.app</w:t>
+      </w:r>
+      <w:proofErr w:type="spellEnd"/>
+      <w:r>
+        <w:t xml:space="preserve"> </w:t>
+      </w:r>
+      <w:r>
+        <w:rPr>
+          <w:rtl/>
+        </w:rPr>
+        <w:t>عبر</w:t>
+      </w:r>
+      <w:r>
+        <w:t xml:space="preserve"> </w:t>
+      </w:r>
+      <w:proofErr w:type="spellStart"/>
+      <w:r>
+        <w:t>Vercel</w:t>
+      </w:r>
+      <w:proofErr w:type="spellEnd"/>
+    </w:p>
+    <w:p>
+      <w:pPr>
+        <w:numPr>
+          <w:ilvl w:val="0"/>
+          <w:numId w:val="6"/>
+        </w:numPr>
+      </w:pPr>
+      <w:r>
+        <w:rPr>
+          <w:b/>
+          <w:bCs/>
+          <w:rtl/>
+        </w:rPr>
+        <w:t>الكود المصدري</w:t>
+      </w:r>
+      <w:r>
+        <w:t xml:space="preserve">: </w:t>
+      </w:r>
+      <w:r>
+        <w:rPr>
+          <w:rtl/>
+        </w:rPr>
+        <w:t>محفوظ على</w:t>
+      </w:r>
+      <w:r>
+        <w:t xml:space="preserve"> GitHub (github.com/ahmadzouikli123/</w:t>
+      </w:r>
+      <w:proofErr w:type="spellStart"/>
+      <w:r>
+        <w:t>tajweedoo</w:t>
+      </w:r>
+      <w:proofErr w:type="spellEnd"/>
+      <w:r>
+        <w:t>)</w:t>
+      </w:r>
+    </w:p>
+    <w:p>
+      <w:pPr>
+        <w:numPr>
+          <w:ilvl w:val="0"/>
+          <w:numId w:val="6"/>
+        </w:numPr>
+      </w:pPr>
+      <w:r>
+        <w:rPr>
+          <w:b/>
+          <w:bCs/>
+          <w:rtl/>
+        </w:rPr>
+        <w:t>الخلفية</w:t>
+      </w:r>
+      <w:r>
+        <w:t xml:space="preserve">: </w:t>
+      </w:r>
+      <w:proofErr w:type="spellStart"/>
+      <w:r>
+        <w:t>Appwrite</w:t>
+      </w:r>
+      <w:proofErr w:type="spellEnd"/>
+      <w:r>
+        <w:t xml:space="preserve"> (</w:t>
+      </w:r>
+      <w:r>
+        <w:rPr>
+          <w:rtl/>
+        </w:rPr>
+        <w:t>قاعدة بيانات + مصادقة + تخزين ملفات</w:t>
+      </w:r>
+      <w:r>
+        <w:t>)</w:t>
+      </w:r>
+    </w:p>
+    <w:p>
+      <w:r>
+        <w:rPr>
+          <w:b/>
+          <w:bCs/>
+          <w:rtl/>
+        </w:rPr>
+        <w:t>الميزات المكتملة</w:t>
+      </w:r>
+      <w:r>
+        <w:rPr>
+          <w:b/>
+          <w:bCs/>
+        </w:rPr>
+        <w:t>:</w:t>
+      </w:r>
+    </w:p>
+    <w:p>
+      <w:pPr>
+        <w:numPr>
+          <w:ilvl w:val="0"/>
+          <w:numId w:val="7"/>
+        </w:numPr>
+      </w:pPr>
+      <w:r>
+        <w:rPr>
+          <w:rtl/>
+        </w:rPr>
+        <w:t>حساب معلم (يسجّل طلابه، ينشئ فصول، اختبارات مخصصة)</w:t>
+      </w:r>
+    </w:p>
+    <w:p>
+      <w:pPr>
+        <w:numPr>
+          <w:ilvl w:val="0"/>
+          <w:numId w:val="7"/>
+        </w:numPr>
+      </w:pPr>
+      <w:r>
+        <w:rPr>
+          <w:rtl/>
+        </w:rPr>
+        <w:t>حساب طالب (نجوم، شجرة تقدم كاملة لأحكام التجويد، لوحة صدارة)</w:t>
+      </w:r>
+    </w:p>
+    <w:p>
+      <w:pPr>
+        <w:numPr>
+          <w:ilvl w:val="0"/>
+          <w:numId w:val="7"/>
+        </w:numPr>
+      </w:pPr>
+      <w:r>
+        <w:rPr>
+          <w:rtl/>
+        </w:rPr>
+        <w:t>شجرة تقدم شاملة: مخارج، صفات، مدود (7 أنواع)، أحكام النون/الميم، لفظ الجلالة، أحكام الراء، إدغام عام، علامات الوقف — كلها مزامنة بين المعلم والطالب عبر</w:t>
+      </w:r>
+      <w:r>
+        <w:t xml:space="preserve"> </w:t>
+      </w:r>
+      <w:proofErr w:type="spellStart"/>
+      <w:r>
+        <w:t>Appwrite</w:t>
+      </w:r>
+      <w:proofErr w:type="spellEnd"/>
+    </w:p>
+    <w:p>
+      <w:pPr>
+        <w:numPr>
+          <w:ilvl w:val="0"/>
+          <w:numId w:val="7"/>
+        </w:numPr>
+      </w:pPr>
+      <w:r>
+        <w:rPr>
+          <w:rtl/>
+        </w:rPr>
+        <w:t>تسجيل تلاوة صوتي</w:t>
+      </w:r>
+      <w:r>
+        <w:t xml:space="preserve"> (</w:t>
+      </w:r>
+      <w:r>
+        <w:rPr>
+          <w:rtl/>
+        </w:rPr>
+        <w:t>بدون</w:t>
+      </w:r>
+      <w:r>
+        <w:t xml:space="preserve"> AI) + </w:t>
+      </w:r>
+      <w:r>
+        <w:rPr>
+          <w:rtl/>
+        </w:rPr>
+        <w:t>مراجعة المعلم بتقييم وملاحظات</w:t>
+      </w:r>
+    </w:p>
+    <w:p>
+      <w:pPr>
+        <w:numPr>
+          <w:ilvl w:val="0"/>
+          <w:numId w:val="7"/>
+        </w:numPr>
+      </w:pPr>
+      <w:r>
+        <w:rPr>
+          <w:rtl/>
+        </w:rPr>
+        <w:t>شارات، احتفالات، زر ملء الشاشة، دخول سريع من شاشة الترحيب</w:t>
+      </w:r>
+    </w:p>
+    <w:p>
+      <w:r>
+        <w:rPr>
+          <w:b/>
+          <w:bCs/>
+          <w:rtl/>
+        </w:rPr>
+        <w:t>للاستمرار بالتطوير</w:t>
+      </w:r>
+      <w:r>
+        <w:rPr>
+          <w:b/>
+          <w:bCs/>
+        </w:rPr>
+        <w:t>:</w:t>
+      </w:r>
+      <w:r>
+        <w:t xml:space="preserve"> </w:t>
+      </w:r>
+      <w:r>
+        <w:rPr>
+          <w:rtl/>
+        </w:rPr>
+        <w:t xml:space="preserve">ارفع نفس ملف </w:t>
+      </w:r>
+      <w:r>
+        <w:t xml:space="preserve">index.html </w:t>
+      </w:r>
+      <w:r>
+        <w:rPr>
+          <w:rtl/>
+        </w:rPr>
+        <w:t xml:space="preserve">بالمحادثة الجديدة وقل "هذا امتداد لمشروع </w:t>
+      </w:r>
+      <w:proofErr w:type="spellStart"/>
+      <w:r>
+        <w:rPr>
+          <w:rtl/>
+        </w:rPr>
+        <w:t>تجويدو</w:t>
+      </w:r>
+      <w:proofErr w:type="spellEnd"/>
+      <w:r>
+        <w:rPr>
+          <w:rtl/>
+        </w:rPr>
+        <w:t>، أكمل من هنا" — واذكر أي شي محدد تبي تشتغل عليه</w:t>
+      </w:r>
+      <w:r>
+        <w:t>.</w:t>
+      </w:r>
+    </w:p>
+    <w:p>
+      <w:r>
+        <w:rPr>
+          <w:b/>
+          <w:bCs/>
+          <w:rtl/>
+        </w:rPr>
+        <w:t>الخيارات المتبقية لو حبيت تكمل مستقبلاً</w:t>
+      </w:r>
+      <w:r>
+        <w:rPr>
+          <w:b/>
+          <w:bCs/>
+        </w:rPr>
+        <w:t>:</w:t>
+      </w:r>
+      <w:r>
+        <w:t xml:space="preserve"> </w:t>
+      </w:r>
+      <w:r>
+        <w:rPr>
+          <w:rtl/>
+        </w:rPr>
+        <w:t>تحليل تلاوة بالذكاء الاصطناعي (مكلف ومعقد)، أو تشديد الصلاحيات عبر</w:t>
+      </w:r>
+      <w:r>
+        <w:t xml:space="preserve"> </w:t>
+      </w:r>
+      <w:proofErr w:type="spellStart"/>
+      <w:r>
+        <w:t>Appwrite</w:t>
+      </w:r>
+      <w:proofErr w:type="spellEnd"/>
+      <w:r>
+        <w:t xml:space="preserve"> Function (</w:t>
+      </w:r>
+      <w:proofErr w:type="spellStart"/>
+      <w:r>
+        <w:rPr>
+          <w:rtl/>
+        </w:rPr>
+        <w:t>مو</w:t>
+      </w:r>
+      <w:proofErr w:type="spellEnd"/>
+      <w:r>
+        <w:rPr>
+          <w:rtl/>
+        </w:rPr>
+        <w:t xml:space="preserve"> ملّح حاليًا</w:t>
+      </w:r>
+      <w:r>
+        <w:t>).</w:t>
+      </w:r>
+    </w:p>
+    <w:p>
+      <w:r>
+        <w:rPr>
+          <w:rtl/>
+        </w:rPr>
+        <w:t>بالتوفيق بمشروعك</w:t>
+      </w:r>
+      <w:r>
+        <w:t xml:space="preserve">! </w:t>
+      </w:r>
+      <w:r>
+        <w:rPr>
+          <w:rFonts w:ascii="Segoe UI Emoji" w:hAnsi="Segoe UI Emoji" w:cs="Segoe UI Emoji"/>
+        </w:rPr>
+        <w:t>🌙📖</w:t>
+      </w:r>
+    </w:p>
+    <w:p>
+      <w:r>
+        <w:rPr>
+          <w:rtl/>
+        </w:rPr>
+        <w:t xml:space="preserve">كخبير تجويد محترف </w:t>
+      </w:r>
+      <w:proofErr w:type="gramStart"/>
+      <w:r>
+        <w:rPr>
+          <w:rtl/>
+        </w:rPr>
+        <w:t>و منشئ</w:t>
+      </w:r>
+      <w:proofErr w:type="gramEnd"/>
+      <w:r>
+        <w:rPr>
+          <w:rtl/>
+        </w:rPr>
+        <w:t xml:space="preserve"> برامج تعليمية هل البرنامج جاهز للنشر</w:t>
+      </w:r>
+    </w:p>
+    <w:p>
+      <w:r>
+        <w:rPr>
+          <w:rtl/>
+        </w:rPr>
+        <w:t>قيّم الجاهزية وحدّد عوائق قانونية وتقنية حرجة</w:t>
+      </w:r>
+    </w:p>
+    <w:p>
+      <w:r>
+        <w:rPr>
+          <w:rtl/>
+        </w:rPr>
+        <w:t>قيّم الجاهزية وحدّد عوائق قانونية وتقنية حرجة</w:t>
+      </w:r>
+    </w:p>
+    <w:p>
+      <w:r>
+        <w:rPr>
+          <w:rtl/>
+        </w:rPr>
+        <w:t>رأيي الصريح</w:t>
+      </w:r>
+      <w:r>
+        <w:t xml:space="preserve">: </w:t>
+      </w:r>
+      <w:r>
+        <w:rPr>
+          <w:b/>
+          <w:bCs/>
+          <w:rtl/>
+        </w:rPr>
+        <w:t xml:space="preserve">جاهز للنشر المحدود (تجربة حقيقية مع فصلك/طلابك)، لكن </w:t>
+      </w:r>
+      <w:proofErr w:type="spellStart"/>
+      <w:r>
+        <w:rPr>
+          <w:b/>
+          <w:bCs/>
+          <w:rtl/>
+        </w:rPr>
+        <w:t>مو</w:t>
+      </w:r>
+      <w:proofErr w:type="spellEnd"/>
+      <w:r>
+        <w:rPr>
+          <w:b/>
+          <w:bCs/>
+          <w:rtl/>
+        </w:rPr>
+        <w:t xml:space="preserve"> جاهز للنشر العام/التجاري بعد</w:t>
+      </w:r>
+      <w:r>
+        <w:rPr>
+          <w:rtl/>
+        </w:rPr>
+        <w:t xml:space="preserve"> </w:t>
+      </w:r>
+      <w:r>
+        <w:t xml:space="preserve">— </w:t>
+      </w:r>
+      <w:r>
+        <w:rPr>
+          <w:rtl/>
+        </w:rPr>
+        <w:t>وهذا فرق مهم أوضحه لك بالتفصيل من زاويتين: المحتوى الشرعي والتقني</w:t>
+      </w:r>
+      <w:r>
+        <w:t>.</w:t>
+      </w:r>
+    </w:p>
+    <w:p>
+      <w:pPr>
+        <w:rPr>
+          <w:b/>
+          <w:bCs/>
+        </w:rPr>
+      </w:pPr>
+      <w:r>
+        <w:rPr>
+          <w:rFonts w:ascii="Segoe UI Emoji" w:hAnsi="Segoe UI Emoji" w:cs="Segoe UI Emoji"/>
+          <w:b/>
+          <w:bCs/>
+        </w:rPr>
+        <w:lastRenderedPageBreak/>
+        <w:t>📖</w:t>
+      </w:r>
+      <w:r>
+        <w:rPr>
+          <w:b/>
+          <w:bCs/>
+        </w:rPr>
+        <w:t xml:space="preserve"> </w:t>
+      </w:r>
+      <w:r>
+        <w:rPr>
+          <w:b/>
+          <w:bCs/>
+          <w:rtl/>
+        </w:rPr>
+        <w:t>من ناحية المحتوى (الأهم والأخطر)</w:t>
+      </w:r>
+    </w:p>
+    <w:p>
+      <w:r>
+        <w:rPr>
+          <w:b/>
+          <w:bCs/>
+          <w:rtl/>
+        </w:rPr>
+        <w:t xml:space="preserve">كوني "خبير تجويد" </w:t>
+      </w:r>
+      <w:proofErr w:type="spellStart"/>
+      <w:r>
+        <w:rPr>
+          <w:b/>
+          <w:bCs/>
+          <w:rtl/>
+        </w:rPr>
+        <w:t>بهالسياق</w:t>
+      </w:r>
+      <w:proofErr w:type="spellEnd"/>
+      <w:r>
+        <w:rPr>
+          <w:b/>
+          <w:bCs/>
+          <w:rtl/>
+        </w:rPr>
+        <w:t>، لازم أكون صريح معك</w:t>
+      </w:r>
+      <w:r>
+        <w:rPr>
+          <w:b/>
+          <w:bCs/>
+        </w:rPr>
+        <w:t>:</w:t>
+      </w:r>
+      <w:r>
+        <w:t xml:space="preserve"> </w:t>
+      </w:r>
+      <w:r>
+        <w:rPr>
+          <w:rtl/>
+        </w:rPr>
+        <w:t>أنا بنيت كل المحتوى (الأحكام، الأمثلة القرآنية، الأسئلة) بأفضل معرفتي، وصحّحنا أخطاء لقيناها بالطريق (تذكّر خطأ "بسم الله" تفخيم/ترقيق، وخطأ كلمة "التفشي"). هذا يثبت شيئين معًا</w:t>
+      </w:r>
+      <w:r>
+        <w:t>:</w:t>
+      </w:r>
+    </w:p>
+    <w:p>
+      <w:pPr>
+        <w:numPr>
+          <w:ilvl w:val="0"/>
+          <w:numId w:val="8"/>
+        </w:numPr>
+      </w:pPr>
+      <w:r>
+        <w:rPr>
+          <w:rtl/>
+        </w:rPr>
+        <w:t>المحتوى بشكل عام دقيق ومبني على مراجع تجويد كلاسيكية موثوقة</w:t>
+      </w:r>
+    </w:p>
+    <w:p>
+      <w:pPr>
+        <w:numPr>
+          <w:ilvl w:val="0"/>
+          <w:numId w:val="8"/>
+        </w:numPr>
+      </w:pPr>
+      <w:r>
+        <w:rPr>
+          <w:b/>
+          <w:bCs/>
+          <w:rtl/>
+        </w:rPr>
+        <w:t>لكن أخطاء فعلية مرّت فعليًا</w:t>
+      </w:r>
+      <w:r>
+        <w:rPr>
+          <w:rtl/>
+        </w:rPr>
+        <w:t xml:space="preserve"> قبل ما تكتشفها أنت — وأنا لست عالم تجويد مُجاز، ولا بديل عن مراجعة بشرية متخصصة</w:t>
+      </w:r>
+    </w:p>
+    <w:p>
+      <w:r>
+        <w:rPr>
+          <w:b/>
+          <w:bCs/>
+          <w:rtl/>
+        </w:rPr>
+        <w:t>قبل أي نشر عام</w:t>
+      </w:r>
+      <w:r>
+        <w:t xml:space="preserve">: </w:t>
+      </w:r>
+      <w:r>
+        <w:rPr>
+          <w:rtl/>
+        </w:rPr>
+        <w:t xml:space="preserve">لازم </w:t>
+      </w:r>
+      <w:r>
+        <w:rPr>
+          <w:b/>
+          <w:bCs/>
+          <w:rtl/>
+        </w:rPr>
+        <w:t>معلم/عالم تجويد مُجاز</w:t>
+      </w:r>
+      <w:r>
+        <w:rPr>
+          <w:rtl/>
+        </w:rPr>
+        <w:t xml:space="preserve"> (بسند أو شهادة معتمدة) يراجع </w:t>
+      </w:r>
+      <w:r>
+        <w:rPr>
+          <w:b/>
+          <w:bCs/>
+          <w:rtl/>
+        </w:rPr>
+        <w:t>كل</w:t>
+      </w:r>
+      <w:r>
+        <w:rPr>
+          <w:rtl/>
+        </w:rPr>
+        <w:t xml:space="preserve"> المحتوى كلمة كلمة — خصوصًا الأحكام والأمثلة والإجابات الصحيحة بكل الاختبارات. هذا </w:t>
+      </w:r>
+      <w:proofErr w:type="spellStart"/>
+      <w:r>
+        <w:rPr>
+          <w:rtl/>
+        </w:rPr>
+        <w:t>مو</w:t>
+      </w:r>
+      <w:proofErr w:type="spellEnd"/>
+      <w:r>
+        <w:rPr>
+          <w:rtl/>
+        </w:rPr>
+        <w:t xml:space="preserve"> اختياري لتطبيق </w:t>
+      </w:r>
+      <w:proofErr w:type="spellStart"/>
+      <w:r>
+        <w:rPr>
+          <w:rtl/>
+        </w:rPr>
+        <w:t>بيعلّم</w:t>
+      </w:r>
+      <w:proofErr w:type="spellEnd"/>
+      <w:r>
+        <w:rPr>
+          <w:rtl/>
+        </w:rPr>
+        <w:t xml:space="preserve"> أطفال قراءة القرآن؛ خطأ ينتشر بصمت وينتقل لأجيال. هذي أولوية أعلى من أي شي تقني</w:t>
+      </w:r>
+      <w:r>
+        <w:t>.</w:t>
+      </w:r>
+    </w:p>
+    <w:p>
+      <w:pPr>
+        <w:rPr>
+          <w:b/>
+          <w:bCs/>
+        </w:rPr>
+      </w:pPr>
+      <w:r>
+        <w:rPr>
+          <w:rFonts w:ascii="Segoe UI Emoji" w:hAnsi="Segoe UI Emoji" w:cs="Segoe UI Emoji"/>
+          <w:b/>
+          <w:bCs/>
+        </w:rPr>
+        <w:t>💻</w:t>
+      </w:r>
+      <w:r>
+        <w:rPr>
+          <w:b/>
+          <w:bCs/>
+        </w:rPr>
+        <w:t xml:space="preserve"> </w:t>
+      </w:r>
+      <w:r>
+        <w:rPr>
+          <w:b/>
+          <w:bCs/>
+          <w:rtl/>
+        </w:rPr>
+        <w:t>من الناحية التقنية</w:t>
+      </w:r>
+    </w:p>
+    <w:p>
+      <w:r>
+        <w:rPr>
+          <w:b/>
+          <w:bCs/>
+          <w:rtl/>
+        </w:rPr>
+        <w:t>جاهز لـ</w:t>
+      </w:r>
+      <w:r>
+        <w:rPr>
+          <w:b/>
+          <w:bCs/>
+        </w:rPr>
+        <w:t>:</w:t>
+      </w:r>
+    </w:p>
+    <w:p>
+      <w:pPr>
+        <w:numPr>
+          <w:ilvl w:val="0"/>
+          <w:numId w:val="9"/>
+        </w:numPr>
+      </w:pPr>
+      <w:r>
+        <w:rPr>
+          <w:rtl/>
+        </w:rPr>
+        <w:t>استخدام حقيقي بفصل واحد أو عدة فصول تعرفهم شخصيًا (زي وضعك الحالي بالضبط)</w:t>
+      </w:r>
+    </w:p>
+    <w:p>
+      <w:pPr>
+        <w:numPr>
+          <w:ilvl w:val="0"/>
+          <w:numId w:val="9"/>
+        </w:numPr>
+      </w:pPr>
+      <w:r>
+        <w:rPr>
+          <w:rtl/>
+        </w:rPr>
+        <w:t>تجربة ميدانية حقيقية تجمع لك ملاحظات</w:t>
+      </w:r>
+    </w:p>
+    <w:p>
+      <w:r>
+        <w:rPr>
+          <w:b/>
+          <w:bCs/>
+          <w:rtl/>
+        </w:rPr>
+        <w:t>غير جاهز لـ نشر عام/تجاري بدون</w:t>
+      </w:r>
+      <w:r>
+        <w:rPr>
+          <w:b/>
+          <w:bCs/>
+        </w:rPr>
+        <w:t>:</w:t>
+      </w:r>
+    </w:p>
+    <w:tbl>
+      <w:tblPr>
+        <w:tblW w:w="0" w:type="auto"/>
+        <w:tblCellSpacing w:w="15" w:type="dxa"/>
+        <w:tblCellMar>
+          <w:top w:w="15" w:type="dxa"/>
+          <w:left w:w="15" w:type="dxa"/>
+          <w:bottom w:w="15" w:type="dxa"/>
+          <w:right w:w="15" w:type="dxa"/>
+        </w:tblCellMar>
+        <w:tblLook w:val="04A0" w:firstRow="1" w:lastRow="0" w:firstColumn="1" w:lastColumn="0" w:noHBand="0" w:noVBand="1"/>
+      </w:tblPr>
+      <w:tblGrid>
+        <w:gridCol w:w="6413"/>
+        <w:gridCol w:w="2947"/>
+      </w:tblGrid>
+      <w:tr>
+        <w:trPr>
+          <w:tblHeader/>
+          <w:tblCellSpacing w:w="15" w:type="dxa"/>
+        </w:trPr>
+        <w:tc>
+          <w:tcPr>
+            <w:tcW w:w="0" w:type="auto"/>
+            <w:vAlign w:val="center"/>
+            <w:hideMark/>
+          </w:tcPr>
+          <w:p>
+            <w:pPr>
+              <w:rPr>
+                <w:b/>
+                <w:bCs/>
+              </w:rPr>
+            </w:pPr>
+            <w:r>
+              <w:rPr>
+                <w:b/>
+                <w:bCs/>
+                <w:rtl/>
+              </w:rPr>
+              <w:t>الفجوة</w:t>
+            </w:r>
+          </w:p>
+        </w:tc>
+        <w:tc>
+          <w:tcPr>
+            <w:tcW w:w="0" w:type="auto"/>
+            <w:vAlign w:val="center"/>
+            <w:hideMark/>
+          </w:tcPr>
+          <w:p>
+            <w:pPr>
+              <w:rPr>
+                <w:b/>
+                <w:bCs/>
+              </w:rPr>
+            </w:pPr>
+            <w:r>
+              <w:rPr>
+                <w:b/>
+                <w:bCs/>
+                <w:rtl/>
+              </w:rPr>
+              <w:t>الخطورة</w:t>
+            </w:r>
+          </w:p>
+        </w:tc>
+      </w:tr>
+      <w:tr>
+        <w:trPr>
+          <w:tblCellSpacing w:w="15" w:type="dxa"/>
+        </w:trPr>
+        <w:tc>
+          <w:tcPr>
+            <w:tcW w:w="0" w:type="auto"/>
+            <w:vAlign w:val="center"/>
+            <w:hideMark/>
+          </w:tcPr>
+          <w:p>
+            <w:r>
+              <w:rPr>
+                <w:b/>
+                <w:bCs/>
+                <w:rtl/>
+              </w:rPr>
+              <w:t>بيانات الأطفال والتسجيلات الصوتية</w:t>
+            </w:r>
+            <w:r>
+              <w:t xml:space="preserve">: </w:t>
+            </w:r>
+            <w:r>
+              <w:rPr>
+                <w:rtl/>
+              </w:rPr>
+              <w:t>تُجمع بدون سياسة خصوصية، بدون موافقة صريحة لولي الأمر، بدون سياسة حذف/احتفاظ بالبيانات</w:t>
+            </w:r>
+          </w:p>
+        </w:tc>
+        <w:tc>
+          <w:tcPr>
+            <w:tcW w:w="0" w:type="auto"/>
+            <w:vAlign w:val="center"/>
+            <w:hideMark/>
+          </w:tcPr>
+          <w:p>
+            <w:r>
+              <w:rPr>
+                <w:rFonts w:ascii="Segoe UI Emoji" w:hAnsi="Segoe UI Emoji" w:cs="Segoe UI Emoji"/>
+              </w:rPr>
+              <w:t>🔴</w:t>
+            </w:r>
+            <w:r>
+              <w:t xml:space="preserve"> </w:t>
+            </w:r>
+            <w:r>
+              <w:rPr>
+                <w:rtl/>
+              </w:rPr>
+              <w:t>عالية — قانونيًا</w:t>
+            </w:r>
+            <w:r>
+              <w:t xml:space="preserve"> (COPPA </w:t>
+            </w:r>
+            <w:r>
+              <w:rPr>
+                <w:rtl/>
+              </w:rPr>
+              <w:t xml:space="preserve">بأمريكا، </w:t>
+            </w:r>
+            <w:r>
+              <w:t xml:space="preserve">GDPR </w:t>
+            </w:r>
+            <w:r>
+              <w:rPr>
+                <w:rtl/>
+              </w:rPr>
+              <w:t>بأوروبا، وأنظمة مشابهة بمعظم الدول</w:t>
+            </w:r>
+            <w:r>
+              <w:t xml:space="preserve">) </w:t>
+            </w:r>
+            <w:r>
+              <w:rPr>
+                <w:rtl/>
+              </w:rPr>
+              <w:t xml:space="preserve">هذا شرط أساسي </w:t>
+            </w:r>
+            <w:proofErr w:type="spellStart"/>
+            <w:r>
+              <w:rPr>
+                <w:rtl/>
+              </w:rPr>
+              <w:t>مو</w:t>
+            </w:r>
+            <w:proofErr w:type="spellEnd"/>
+            <w:r>
+              <w:rPr>
+                <w:rtl/>
+              </w:rPr>
+              <w:t xml:space="preserve"> تفصيل</w:t>
+            </w:r>
+          </w:p>
+        </w:tc>
+      </w:tr>
+      <w:tr>
+        <w:trPr>
+          <w:tblCellSpacing w:w="15" w:type="dxa"/>
+        </w:trPr>
+        <w:tc>
+          <w:tcPr>
+            <w:tcW w:w="0" w:type="auto"/>
+            <w:vAlign w:val="center"/>
+            <w:hideMark/>
+          </w:tcPr>
+          <w:p>
+            <w:r>
+              <w:rPr>
+                <w:b/>
+                <w:bCs/>
+                <w:rtl/>
+              </w:rPr>
+              <w:t>صلاحيات</w:t>
+            </w:r>
+            <w:r>
+              <w:rPr>
+                <w:b/>
+                <w:bCs/>
+              </w:rPr>
+              <w:t xml:space="preserve"> </w:t>
+            </w:r>
+            <w:proofErr w:type="spellStart"/>
+            <w:r>
+              <w:rPr>
+                <w:b/>
+                <w:bCs/>
+              </w:rPr>
+              <w:t>Appwrite</w:t>
+            </w:r>
+            <w:proofErr w:type="spellEnd"/>
+            <w:r>
+              <w:t xml:space="preserve">: </w:t>
+            </w:r>
+            <w:r>
+              <w:rPr>
+                <w:rtl/>
+              </w:rPr>
+              <w:t>استخدمنا نمط "أي مستخدم مسجَّل دخول يقدر يقرأ/يعدّل" كحل وسط سريع بمراحل كثيرة (نجوم، اختبارات، تسجيلات). مقبول لعدد صغير موثوق (فصلك)، لكن لو انفتح لعموم الناس، أي معلم غريب يقدر تقنيًا يشوف/يعدّل بيانات فصول معلمين آخرين</w:t>
+            </w:r>
+          </w:p>
+        </w:tc>
+        <w:tc>
+          <w:tcPr>
+            <w:tcW w:w="0" w:type="auto"/>
+            <w:vAlign w:val="center"/>
+            <w:hideMark/>
+          </w:tcPr>
+          <w:p>
+            <w:r>
+              <w:rPr>
+                <w:rFonts w:ascii="Segoe UI Emoji" w:hAnsi="Segoe UI Emoji" w:cs="Segoe UI Emoji"/>
+              </w:rPr>
+              <w:t>🔴</w:t>
+            </w:r>
+            <w:r>
+              <w:t xml:space="preserve"> </w:t>
+            </w:r>
+            <w:r>
+              <w:rPr>
+                <w:rtl/>
+              </w:rPr>
+              <w:t>عالية</w:t>
+            </w:r>
+          </w:p>
+        </w:tc>
+      </w:tr>
+      <w:tr>
+        <w:trPr>
+          <w:tblCellSpacing w:w="15" w:type="dxa"/>
+        </w:trPr>
+        <w:tc>
+          <w:tcPr>
+            <w:tcW w:w="0" w:type="auto"/>
+            <w:vAlign w:val="center"/>
+            <w:hideMark/>
+          </w:tcPr>
+          <w:p>
+            <w:r>
+              <w:rPr>
+                <w:b/>
+                <w:bCs/>
+              </w:rPr>
+              <w:t>Dev Key</w:t>
+            </w:r>
+            <w:r>
+              <w:t xml:space="preserve">: </w:t>
+            </w:r>
+            <w:r>
+              <w:rPr>
+                <w:rtl/>
+              </w:rPr>
+              <w:t>لسا مفعّل بالكود لتجاوز حدود الحماية من الإساءة — يجب إزالته قبل أي نشر عام</w:t>
+            </w:r>
+          </w:p>
+        </w:tc>
+        <w:tc>
+          <w:tcPr>
+            <w:tcW w:w="0" w:type="auto"/>
+            <w:vAlign w:val="center"/>
+            <w:hideMark/>
+          </w:tcPr>
+          <w:p>
+            <w:r>
+              <w:rPr>
+                <w:rFonts w:ascii="Segoe UI Emoji" w:hAnsi="Segoe UI Emoji" w:cs="Segoe UI Emoji"/>
+              </w:rPr>
+              <w:t>🟡</w:t>
+            </w:r>
+            <w:r>
+              <w:t xml:space="preserve"> </w:t>
+            </w:r>
+            <w:r>
+              <w:rPr>
+                <w:rtl/>
+              </w:rPr>
+              <w:t>متوسطة</w:t>
+            </w:r>
+          </w:p>
+        </w:tc>
+      </w:tr>
+      <w:tr>
+        <w:trPr>
+          <w:tblCellSpacing w:w="15" w:type="dxa"/>
+        </w:trPr>
+        <w:tc>
+          <w:tcPr>
+            <w:tcW w:w="0" w:type="auto"/>
+            <w:vAlign w:val="center"/>
+            <w:hideMark/>
+          </w:tcPr>
+          <w:p>
+            <w:r>
+              <w:rPr>
+                <w:b/>
+                <w:bCs/>
+                <w:rtl/>
+              </w:rPr>
+              <w:t>لا يوجد اختبار جودة منهجي</w:t>
+            </w:r>
+            <w:r>
+              <w:rPr>
+                <w:rtl/>
+              </w:rPr>
+              <w:t xml:space="preserve"> بمقياس أكبر (عشرات الطلاب متزامنين، أجهزة مختلفة)</w:t>
+            </w:r>
+          </w:p>
+        </w:tc>
+        <w:tc>
+          <w:tcPr>
+            <w:tcW w:w="0" w:type="auto"/>
+            <w:vAlign w:val="center"/>
+            <w:hideMark/>
+          </w:tcPr>
+          <w:p>
+            <w:r>
+              <w:rPr>
+                <w:rFonts w:ascii="Segoe UI Emoji" w:hAnsi="Segoe UI Emoji" w:cs="Segoe UI Emoji"/>
+              </w:rPr>
+              <w:t>🟡</w:t>
+            </w:r>
+            <w:r>
+              <w:t xml:space="preserve"> </w:t>
+            </w:r>
+            <w:r>
+              <w:rPr>
+                <w:rtl/>
+              </w:rPr>
+              <w:t>متوسطة</w:t>
+            </w:r>
+          </w:p>
+        </w:tc>
+      </w:tr>
+      <w:tr>
+        <w:trPr>
+          <w:tblCellSpacing w:w="15" w:type="dxa"/>
+        </w:trPr>
+        <w:tc>
+          <w:tcPr>
+            <w:tcW w:w="0" w:type="auto"/>
+            <w:vAlign w:val="center"/>
+            <w:hideMark/>
+          </w:tcPr>
+          <w:p>
+            <w:r>
+              <w:rPr>
+                <w:b/>
+                <w:bCs/>
+                <w:rtl/>
+              </w:rPr>
+              <w:t>لا سياسة خصوصية ولا شروط استخدام</w:t>
+            </w:r>
+            <w:r>
+              <w:rPr>
+                <w:rtl/>
+              </w:rPr>
+              <w:t xml:space="preserve"> مكتوبة أصلًا بالتطبيق</w:t>
+            </w:r>
+          </w:p>
+        </w:tc>
+        <w:tc>
+          <w:tcPr>
+            <w:tcW w:w="0" w:type="auto"/>
+            <w:vAlign w:val="center"/>
+            <w:hideMark/>
+          </w:tcPr>
+          <w:p>
+            <w:r>
+              <w:rPr>
+                <w:rFonts w:ascii="Segoe UI Emoji" w:hAnsi="Segoe UI Emoji" w:cs="Segoe UI Emoji"/>
+              </w:rPr>
+              <w:t>🔴</w:t>
+            </w:r>
+            <w:r>
+              <w:t xml:space="preserve"> </w:t>
+            </w:r>
+            <w:r>
+              <w:rPr>
+                <w:rtl/>
+              </w:rPr>
+              <w:t>عالية للنشر العام</w:t>
+            </w:r>
+          </w:p>
+        </w:tc>
+      </w:tr>
+    </w:tbl>
+    <w:p>
+      <w:pPr>
+        <w:rPr>
+          <w:b/>
+          <w:bCs/>
+        </w:rPr>
+      </w:pPr>
+      <w:r>
+        <w:rPr>
+          <w:b/>
+          <w:bCs/>
+          <w:rtl/>
+        </w:rPr>
+        <w:t>توصيتي الصريحة</w:t>
+      </w:r>
+    </w:p>
+    <w:p>
+      <w:r>
+        <w:rPr>
+          <w:b/>
+          <w:bCs/>
+          <w:rtl/>
+        </w:rPr>
+        <w:t>الآن</w:t>
+      </w:r>
+      <w:r>
+        <w:t xml:space="preserve">: </w:t>
+      </w:r>
+      <w:r>
+        <w:rPr>
+          <w:rtl/>
+        </w:rPr>
+        <w:t>استمر تستخدمه مع طلابك الحاليين براحتك — هذا فعليًا أفضل اختبار حقيقي ممكن، وهو بالضبط الاستخدام الآمن حاليًا</w:t>
+      </w:r>
+      <w:r>
+        <w:t>.</w:t>
+      </w:r>
+    </w:p>
+    <w:p>
+      <w:r>
+        <w:rPr>
+          <w:b/>
+          <w:bCs/>
+          <w:rtl/>
+        </w:rPr>
+        <w:t>قبل أي توسّع</w:t>
+      </w:r>
+      <w:r>
+        <w:rPr>
+          <w:rtl/>
+        </w:rPr>
+        <w:t xml:space="preserve"> (فصول لناس ما تعرفهم، أو نشر عام، أو أي طموح تجاري): رتّب الأولويات </w:t>
+      </w:r>
+      <w:proofErr w:type="spellStart"/>
+      <w:r>
+        <w:rPr>
+          <w:rtl/>
+        </w:rPr>
+        <w:t>بهالترتيب</w:t>
+      </w:r>
+      <w:proofErr w:type="spellEnd"/>
+      <w:r>
+        <w:t>:</w:t>
+      </w:r>
+    </w:p>
+    <w:p>
+      <w:pPr>
+        <w:numPr>
+          <w:ilvl w:val="0"/>
+          <w:numId w:val="10"/>
+        </w:numPr>
+      </w:pPr>
+      <w:r>
+        <w:rPr>
+          <w:rtl/>
+        </w:rPr>
+        <w:t>مراجعة شرعية كاملة للمحتوى من مختص تجويد</w:t>
+      </w:r>
+    </w:p>
+    <w:p>
+      <w:pPr>
+        <w:numPr>
+          <w:ilvl w:val="0"/>
+          <w:numId w:val="10"/>
+        </w:numPr>
+      </w:pPr>
+      <w:r>
+        <w:rPr>
+          <w:rtl/>
+        </w:rPr>
+        <w:t>سياسة خصوصية + موافقة ولي الأمر (حتى لو صفحة بسيطة)</w:t>
+      </w:r>
+    </w:p>
+    <w:p>
+      <w:pPr>
+        <w:numPr>
+          <w:ilvl w:val="0"/>
+          <w:numId w:val="10"/>
+        </w:numPr>
+      </w:pPr>
+      <w:r>
+        <w:rPr>
+          <w:rtl/>
+        </w:rPr>
+        <w:t>مراجعة الصلاحيات الأمنية</w:t>
+      </w:r>
+      <w:r>
+        <w:t xml:space="preserve"> (</w:t>
+      </w:r>
+      <w:r>
+        <w:rPr>
+          <w:rtl/>
+        </w:rPr>
+        <w:t>تحتاج على الأغلب الانتقال لـ</w:t>
+      </w:r>
+      <w:r>
+        <w:t xml:space="preserve"> </w:t>
+      </w:r>
+      <w:proofErr w:type="spellStart"/>
+      <w:r>
+        <w:t>Appwrite</w:t>
+      </w:r>
+      <w:proofErr w:type="spellEnd"/>
+      <w:r>
+        <w:t xml:space="preserve"> Functions </w:t>
+      </w:r>
+      <w:r>
+        <w:rPr>
+          <w:rtl/>
+        </w:rPr>
+        <w:t>بدل الاعتماد على صلاحيات العميل المباشرة</w:t>
+      </w:r>
+      <w:r>
+        <w:t>)</w:t>
+      </w:r>
+    </w:p>
+    <w:p>
+      <w:r>
+        <w:rPr>
+          <w:rtl/>
+        </w:rPr>
+        <w:lastRenderedPageBreak/>
+        <w:t xml:space="preserve">تحب نبدأ بأي من </w:t>
+      </w:r>
+      <w:proofErr w:type="spellStart"/>
+      <w:r>
+        <w:rPr>
+          <w:rtl/>
+        </w:rPr>
+        <w:t>هالنقاط</w:t>
+      </w:r>
+      <w:proofErr w:type="spellEnd"/>
+      <w:r>
+        <w:rPr>
+          <w:rtl/>
+        </w:rPr>
+        <w:t xml:space="preserve"> الثلاث؟</w:t>
+      </w:r>
+    </w:p>
+    <w:p>
+      <w:pPr>
+        <w:rPr>
+          <w:rtl/>
+        </w:rPr>
+      </w:pPr>
+    </w:p>
+    <w:p>
+      <w:pPr>
+        <w:rPr>
+          <w:rtl/>
+        </w:rPr>
+      </w:pPr>
+    </w:p>
+    <w:p>
+      <w:pPr>
+        <w:rPr>
+          <w:rtl/>
+        </w:rPr>
+      </w:pPr>
+    </w:p>
+    <w:p>
+      <w:pPr>
+        <w:rPr>
+          <w:rtl/>
+        </w:rPr>
+      </w:pPr>
+    </w:p>
+    <w:p>
+      <w:pPr>
+        <w:rPr>
+          <w:rtl/>
+        </w:rPr>
+      </w:pPr>
+    </w:p>
+    <w:p>
+      <w:pPr>
+        <w:rPr>
+          <w:rtl/>
+        </w:rPr>
+      </w:pPr>
+    </w:p>
+    <w:p>
+      <w:pPr>
+        <w:rPr>
+          <w:rtl/>
+        </w:rPr>
+      </w:pPr>
+    </w:p>
+    <w:p>
+      <w:pPr>
+        <w:rPr>
+          <w:rtl/>
+        </w:rPr>
+      </w:pPr>
+    </w:p>
+    <w:p>
+      <w:pPr>
+        <w:rPr>
+          <w:rtl/>
+        </w:rPr>
+      </w:pPr>
+    </w:p>
+    <w:p>
+      <w:pPr>
+        <w:rPr>
+          <w:rtl/>
+        </w:rPr>
+      </w:pPr>
+    </w:p>
+    <w:p>
+      <w:pPr>
+        <w:rPr>
+          <w:rtl/>
+        </w:rPr>
+      </w:pPr>
+    </w:p>
+    <w:p>
+      <w:pPr>
+        <w:rPr>
+          <w:rtl/>
+        </w:rPr>
+      </w:pPr>
+    </w:p>
+    <w:p>
+      <w:pPr>
+        <w:rPr>
+          <w:rtl/>
+        </w:rPr>
+      </w:pPr>
+    </w:p>
+    <w:p>
+      <w:pPr>
+        <w:rPr>
+          <w:rtl/>
+        </w:rPr>
+      </w:pPr>
+    </w:p>
+    <w:p>
+      <w:pPr>
+        <w:rPr>
+          <w:rtl/>
+        </w:rPr>
+      </w:pPr>
+    </w:p>
+    <w:p>
+      <w:pPr>
+        <w:rPr>
+          <w:rtl/>
+        </w:rPr>
+      </w:pPr>
+    </w:p>
+    <w:p>
+      <w:pPr>
+        <w:rPr>
+          <w:rtl/>
+        </w:rPr>
+      </w:pPr>
+    </w:p>
+    <w:p>
+      <w:pPr>
+        <w:rPr>
+          <w:rtl/>
+        </w:rPr>
+      </w:pPr>
+    </w:p>
+    <w:p>
+      <w:pPr>
+        <w:rPr>
+          <w:rtl/>
+        </w:rPr>
+      </w:pPr>
     </w:p>
     <w:p>
       <w:r>
@@ -158,6 +1690,7 @@
         <w:rPr>
           <w:rtl/>
         </w:rPr>
+        <w:lastRenderedPageBreak/>
         <w:t>بيطلع</w:t>
       </w:r>
       <w:proofErr w:type="spellEnd"/>
@@ -511,7 +2044,6 @@
     </w:p>
     <w:p>
       <w:r>
-        <w:lastRenderedPageBreak/>
         <w:t>https://github.com/ahmadzouikli123/tajweedoo</w:t>
       </w:r>
     </w:p>
@@ -680,6 +2212,7 @@
     </w:p>
     <w:p>
       <w:r>
+        <w:lastRenderedPageBreak/>
         <w:t>git log --</w:t>
       </w:r>
       <w:proofErr w:type="spellStart"/>
@@ -831,6 +2364,119 @@
 <file path=word/numbering.xml><?xml version="1.0" encoding="utf-8"?>
 <w:numbering xmlns:wpc="http://schemas.microsoft.com/office/word/2010/wordprocessingCanvas" xmlns:cx="http://schemas.microsoft.com/office/drawing/2014/chartex" xmlns:cx1="http://schemas.microsoft.com/office/drawing/2015/9/8/chartex" xmlns:cx2="http://schemas.microsoft.com/office/drawing/2015/10/21/chartex" xmlns:cx3="http://schemas.microsoft.com/office/drawing/2016/5/9/chartex" xmlns:cx4="http://schemas.microsoft.com/office/drawing/2016/5/10/chartex" xmlns:cx5="http://schemas.microsoft.com/office/drawing/2016/5/11/chartex" xmlns:cx6="http://schemas.microsoft.com/office/drawing/2016/5/12/chartex" xmlns:cx7="http://schemas.microsoft.com/office/drawing/2016/5/13/chartex" xmlns:cx8="http://schemas.microsoft.com/office/drawing/2016/5/14/chartex" xmlns:mc="http://schemas.openxmlformats.org/markup-compatibility/2006" xmlns:aink="http://schemas.microsoft.com/office/drawing/2016/ink" xmlns:am3d="http://schemas.microsoft.com/office/drawing/2017/model3d" xmlns:o="urn:schemas-microsoft-com:office:office" xmlns:oel="http://schemas.microsoft.com/office/2019/extlst" xmlns:r="http://schemas.openxmlformats.org/officeDocument/2006/relationships" xmlns:m="http://schemas.openxmlformats.org/officeDocument/2006/math" xmlns:v="urn:schemas-microsoft-com:vml" xmlns:wp14="http://schemas.microsoft.com/office/word/2010/wordprocessingDrawing" xmlns:wp="http://schemas.openxmlformats.org/drawingml/2006/wordprocessingDrawing" xmlns:w10="urn:schemas-microsoft-com:office:word" xmlns:w="http://schemas.openxmlformats.org/wordprocessingml/2006/main" xmlns:w14="http://schemas.microsoft.com/office/word/2010/wordml" xmlns:w15="http://schemas.microsoft.com/office/word/2012/wordml" xmlns:w16cex="http://schemas.microsoft.com/office/word/2018/wordml/cex" xmlns:w16cid="http://schemas.microsoft.com/office/word/2016/wordml/cid" xmlns:w16="http://schemas.microsoft.com/office/word/2018/wordml" xmlns:w16du="http://schemas.microsoft.com/office/word/2023/wordml/word16du" xmlns:w16sdtdh="http://schemas.microsoft.com/office/word/2020/wordml/sdtdatahash" xmlns:w16sdtfl="http://schemas.microsoft.com/office/word/2024/wordml/sdtformatlock" xmlns:w16se="http://schemas.microsoft.com/office/word/2015/wordml/symex" xmlns:wpg="http://schemas.microsoft.com/office/word/2010/wordprocessingGroup" xmlns:wpi="http://schemas.microsoft.com/office/word/2010/wordprocessingInk" xmlns:wne="http://schemas.microsoft.com/office/word/2006/wordml" xmlns:wps="http://schemas.microsoft.com/office/word/2010/wordprocessingShape" mc:Ignorable="w14 w15 w16se w16cid w16 w16cex w16sdtdh w16sdtfl w16du wp14">
   <w:abstractNum w:abstractNumId="0" w15:restartNumberingAfterBreak="0">
+    <w:nsid w:val="0931591B"/>
+    <w:multiLevelType w:val="multilevel"/>
+    <w:tmpl w:val="6792AE22"/>
+    <w:lvl w:ilvl="0">
+      <w:start w:val="1"/>
+      <w:numFmt w:val="decimal"/>
+      <w:lvlText w:val="%1."/>
+      <w:lvlJc w:val="left"/>
+      <w:pPr>
+        <w:tabs>
+          <w:tab w:val="num" w:pos="720"/>
+        </w:tabs>
+        <w:ind w:left="720" w:hanging="360"/>
+      </w:pPr>
+    </w:lvl>
+    <w:lvl w:ilvl="1" w:tentative="1">
+      <w:start w:val="1"/>
+      <w:numFmt w:val="decimal"/>
+      <w:lvlText w:val="%2."/>
+      <w:lvlJc w:val="left"/>
+      <w:pPr>
+        <w:tabs>
+          <w:tab w:val="num" w:pos="1440"/>
+        </w:tabs>
+        <w:ind w:left="1440" w:hanging="360"/>
+      </w:pPr>
+    </w:lvl>
+    <w:lvl w:ilvl="2" w:tentative="1">
+      <w:start w:val="1"/>
+      <w:numFmt w:val="decimal"/>
+      <w:lvlText w:val="%3."/>
+      <w:lvlJc w:val="left"/>
+      <w:pPr>
+        <w:tabs>
+          <w:tab w:val="num" w:pos="2160"/>
+        </w:tabs>
+        <w:ind w:left="2160" w:hanging="360"/>
+      </w:pPr>
+    </w:lvl>
+    <w:lvl w:ilvl="3" w:tentative="1">
+      <w:start w:val="1"/>
+      <w:numFmt w:val="decimal"/>
+      <w:lvlText w:val="%4."/>
+      <w:lvlJc w:val="left"/>
+      <w:pPr>
+        <w:tabs>
+          <w:tab w:val="num" w:pos="2880"/>
+        </w:tabs>
+        <w:ind w:left="2880" w:hanging="360"/>
+      </w:pPr>
+    </w:lvl>
+    <w:lvl w:ilvl="4" w:tentative="1">
+      <w:start w:val="1"/>
+      <w:numFmt w:val="decimal"/>
+      <w:lvlText w:val="%5."/>
+      <w:lvlJc w:val="left"/>
+      <w:pPr>
+        <w:tabs>
+          <w:tab w:val="num" w:pos="3600"/>
+        </w:tabs>
+        <w:ind w:left="3600" w:hanging="360"/>
+      </w:pPr>
+    </w:lvl>
+    <w:lvl w:ilvl="5" w:tentative="1">
+      <w:start w:val="1"/>
+      <w:numFmt w:val="decimal"/>
+      <w:lvlText w:val="%6."/>
+      <w:lvlJc w:val="left"/>
+      <w:pPr>
+        <w:tabs>
+          <w:tab w:val="num" w:pos="4320"/>
+        </w:tabs>
+        <w:ind w:left="4320" w:hanging="360"/>
+      </w:pPr>
+    </w:lvl>
+    <w:lvl w:ilvl="6" w:tentative="1">
+      <w:start w:val="1"/>
+      <w:numFmt w:val="decimal"/>
+      <w:lvlText w:val="%7."/>
+      <w:lvlJc w:val="left"/>
+      <w:pPr>
+        <w:tabs>
+          <w:tab w:val="num" w:pos="5040"/>
+        </w:tabs>
+        <w:ind w:left="5040" w:hanging="360"/>
+      </w:pPr>
+    </w:lvl>
+    <w:lvl w:ilvl="7" w:tentative="1">
+      <w:start w:val="1"/>
+      <w:numFmt w:val="decimal"/>
+      <w:lvlText w:val="%8."/>
+      <w:lvlJc w:val="left"/>
+      <w:pPr>
+        <w:tabs>
+          <w:tab w:val="num" w:pos="5760"/>
+        </w:tabs>
+        <w:ind w:left="5760" w:hanging="360"/>
+      </w:pPr>
+    </w:lvl>
+    <w:lvl w:ilvl="8" w:tentative="1">
+      <w:start w:val="1"/>
+      <w:numFmt w:val="decimal"/>
+      <w:lvlText w:val="%9."/>
+      <w:lvlJc w:val="left"/>
+      <w:pPr>
+        <w:tabs>
+          <w:tab w:val="num" w:pos="6480"/>
+        </w:tabs>
+        <w:ind w:left="6480" w:hanging="360"/>
+      </w:pPr>
+    </w:lvl>
+  </w:abstractNum>
+  <w:abstractNum w:abstractNumId="1" w15:restartNumberingAfterBreak="0">
     <w:nsid w:val="0E772851"/>
     <w:multiLevelType w:val="multilevel"/>
     <w:tmpl w:val="B47CA252"/>
@@ -943,7 +2589,305 @@
       </w:pPr>
     </w:lvl>
   </w:abstractNum>
-  <w:abstractNum w:abstractNumId="1" w15:restartNumberingAfterBreak="0">
+  <w:abstractNum w:abstractNumId="2" w15:restartNumberingAfterBreak="0">
+    <w:nsid w:val="4050028B"/>
+    <w:multiLevelType w:val="multilevel"/>
+    <w:tmpl w:val="750850AC"/>
+    <w:lvl w:ilvl="0">
+      <w:start w:val="1"/>
+      <w:numFmt w:val="bullet"/>
+      <w:lvlText w:val=""/>
+      <w:lvlJc w:val="left"/>
+      <w:pPr>
+        <w:tabs>
+          <w:tab w:val="num" w:pos="720"/>
+        </w:tabs>
+        <w:ind w:left="720" w:hanging="360"/>
+      </w:pPr>
+      <w:rPr>
+        <w:rFonts w:ascii="Symbol" w:hAnsi="Symbol" w:hint="default"/>
+        <w:sz w:val="20"/>
+      </w:rPr>
+    </w:lvl>
+    <w:lvl w:ilvl="1" w:tentative="1">
+      <w:start w:val="1"/>
+      <w:numFmt w:val="bullet"/>
+      <w:lvlText w:val="o"/>
+      <w:lvlJc w:val="left"/>
+      <w:pPr>
+        <w:tabs>
+          <w:tab w:val="num" w:pos="1440"/>
+        </w:tabs>
+        <w:ind w:left="1440" w:hanging="360"/>
+      </w:pPr>
+      <w:rPr>
+        <w:rFonts w:ascii="Courier New" w:hAnsi="Courier New" w:hint="default"/>
+        <w:sz w:val="20"/>
+      </w:rPr>
+    </w:lvl>
+    <w:lvl w:ilvl="2" w:tentative="1">
+      <w:start w:val="1"/>
+      <w:numFmt w:val="bullet"/>
+      <w:lvlText w:val=""/>
+      <w:lvlJc w:val="left"/>
+      <w:pPr>
+        <w:tabs>
+          <w:tab w:val="num" w:pos="2160"/>
+        </w:tabs>
+        <w:ind w:left="2160" w:hanging="360"/>
+      </w:pPr>
+      <w:rPr>
+        <w:rFonts w:ascii="Wingdings" w:hAnsi="Wingdings" w:hint="default"/>
+        <w:sz w:val="20"/>
+      </w:rPr>
+    </w:lvl>
+    <w:lvl w:ilvl="3" w:tentative="1">
+      <w:start w:val="1"/>
+      <w:numFmt w:val="bullet"/>
+      <w:lvlText w:val=""/>
+      <w:lvlJc w:val="left"/>
+      <w:pPr>
+        <w:tabs>
+          <w:tab w:val="num" w:pos="2880"/>
+        </w:tabs>
+        <w:ind w:left="2880" w:hanging="360"/>
+      </w:pPr>
+      <w:rPr>
+        <w:rFonts w:ascii="Wingdings" w:hAnsi="Wingdings" w:hint="default"/>
+        <w:sz w:val="20"/>
+      </w:rPr>
+    </w:lvl>
+    <w:lvl w:ilvl="4" w:tentative="1">
+      <w:start w:val="1"/>
+      <w:numFmt w:val="bullet"/>
+      <w:lvlText w:val=""/>
+      <w:lvlJc w:val="left"/>
+      <w:pPr>
+        <w:tabs>
+          <w:tab w:val="num" w:pos="3600"/>
+        </w:tabs>
+        <w:ind w:left="3600" w:hanging="360"/>
+      </w:pPr>
+      <w:rPr>
+        <w:rFonts w:ascii="Wingdings" w:hAnsi="Wingdings" w:hint="default"/>
+        <w:sz w:val="20"/>
+      </w:rPr>
+    </w:lvl>
+    <w:lvl w:ilvl="5" w:tentative="1">
+      <w:start w:val="1"/>
+      <w:numFmt w:val="bullet"/>
+      <w:lvlText w:val=""/>
+      <w:lvlJc w:val="left"/>
+      <w:pPr>
+        <w:tabs>
+          <w:tab w:val="num" w:pos="4320"/>
+        </w:tabs>
+        <w:ind w:left="4320" w:hanging="360"/>
+      </w:pPr>
+      <w:rPr>
+        <w:rFonts w:ascii="Wingdings" w:hAnsi="Wingdings" w:hint="default"/>
+        <w:sz w:val="20"/>
+      </w:rPr>
+    </w:lvl>
+    <w:lvl w:ilvl="6" w:tentative="1">
+      <w:start w:val="1"/>
+      <w:numFmt w:val="bullet"/>
+      <w:lvlText w:val=""/>
+      <w:lvlJc w:val="left"/>
+      <w:pPr>
+        <w:tabs>
+          <w:tab w:val="num" w:pos="5040"/>
+        </w:tabs>
+        <w:ind w:left="5040" w:hanging="360"/>
+      </w:pPr>
+      <w:rPr>
+        <w:rFonts w:ascii="Wingdings" w:hAnsi="Wingdings" w:hint="default"/>
+        <w:sz w:val="20"/>
+      </w:rPr>
+    </w:lvl>
+    <w:lvl w:ilvl="7" w:tentative="1">
+      <w:start w:val="1"/>
+      <w:numFmt w:val="bullet"/>
+      <w:lvlText w:val=""/>
+      <w:lvlJc w:val="left"/>
+      <w:pPr>
+        <w:tabs>
+          <w:tab w:val="num" w:pos="5760"/>
+        </w:tabs>
+        <w:ind w:left="5760" w:hanging="360"/>
+      </w:pPr>
+      <w:rPr>
+        <w:rFonts w:ascii="Wingdings" w:hAnsi="Wingdings" w:hint="default"/>
+        <w:sz w:val="20"/>
+      </w:rPr>
+    </w:lvl>
+    <w:lvl w:ilvl="8" w:tentative="1">
+      <w:start w:val="1"/>
+      <w:numFmt w:val="bullet"/>
+      <w:lvlText w:val=""/>
+      <w:lvlJc w:val="left"/>
+      <w:pPr>
+        <w:tabs>
+          <w:tab w:val="num" w:pos="6480"/>
+        </w:tabs>
+        <w:ind w:left="6480" w:hanging="360"/>
+      </w:pPr>
+      <w:rPr>
+        <w:rFonts w:ascii="Wingdings" w:hAnsi="Wingdings" w:hint="default"/>
+        <w:sz w:val="20"/>
+      </w:rPr>
+    </w:lvl>
+  </w:abstractNum>
+  <w:abstractNum w:abstractNumId="3" w15:restartNumberingAfterBreak="0">
+    <w:nsid w:val="5FFA53C7"/>
+    <w:multiLevelType w:val="multilevel"/>
+    <w:tmpl w:val="80B4024A"/>
+    <w:lvl w:ilvl="0">
+      <w:start w:val="1"/>
+      <w:numFmt w:val="bullet"/>
+      <w:lvlText w:val=""/>
+      <w:lvlJc w:val="left"/>
+      <w:pPr>
+        <w:tabs>
+          <w:tab w:val="num" w:pos="720"/>
+        </w:tabs>
+        <w:ind w:left="720" w:hanging="360"/>
+      </w:pPr>
+      <w:rPr>
+        <w:rFonts w:ascii="Symbol" w:hAnsi="Symbol" w:hint="default"/>
+        <w:sz w:val="20"/>
+      </w:rPr>
+    </w:lvl>
+    <w:lvl w:ilvl="1" w:tentative="1">
+      <w:start w:val="1"/>
+      <w:numFmt w:val="bullet"/>
+      <w:lvlText w:val="o"/>
+      <w:lvlJc w:val="left"/>
+      <w:pPr>
+        <w:tabs>
+          <w:tab w:val="num" w:pos="1440"/>
+        </w:tabs>
+        <w:ind w:left="1440" w:hanging="360"/>
+      </w:pPr>
+      <w:rPr>
+        <w:rFonts w:ascii="Courier New" w:hAnsi="Courier New" w:hint="default"/>
+        <w:sz w:val="20"/>
+      </w:rPr>
+    </w:lvl>
+    <w:lvl w:ilvl="2" w:tentative="1">
+      <w:start w:val="1"/>
+      <w:numFmt w:val="bullet"/>
+      <w:lvlText w:val=""/>
+      <w:lvlJc w:val="left"/>
+      <w:pPr>
+        <w:tabs>
+          <w:tab w:val="num" w:pos="2160"/>
+        </w:tabs>
+        <w:ind w:left="2160" w:hanging="360"/>
+      </w:pPr>
+      <w:rPr>
+        <w:rFonts w:ascii="Wingdings" w:hAnsi="Wingdings" w:hint="default"/>
+        <w:sz w:val="20"/>
+      </w:rPr>
+    </w:lvl>
+    <w:lvl w:ilvl="3" w:tentative="1">
+      <w:start w:val="1"/>
+      <w:numFmt w:val="bullet"/>
+      <w:lvlText w:val=""/>
+      <w:lvlJc w:val="left"/>
+      <w:pPr>
+        <w:tabs>
+          <w:tab w:val="num" w:pos="2880"/>
+        </w:tabs>
+        <w:ind w:left="2880" w:hanging="360"/>
+      </w:pPr>
+      <w:rPr>
+        <w:rFonts w:ascii="Wingdings" w:hAnsi="Wingdings" w:hint="default"/>
+        <w:sz w:val="20"/>
+      </w:rPr>
+    </w:lvl>
+    <w:lvl w:ilvl="4" w:tentative="1">
+      <w:start w:val="1"/>
+      <w:numFmt w:val="bullet"/>
+      <w:lvlText w:val=""/>
+      <w:lvlJc w:val="left"/>
+      <w:pPr>
+        <w:tabs>
+          <w:tab w:val="num" w:pos="3600"/>
+        </w:tabs>
+        <w:ind w:left="3600" w:hanging="360"/>
+      </w:pPr>
+      <w:rPr>
+        <w:rFonts w:ascii="Wingdings" w:hAnsi="Wingdings" w:hint="default"/>
+        <w:sz w:val="20"/>
+      </w:rPr>
+    </w:lvl>
+    <w:lvl w:ilvl="5" w:tentative="1">
+      <w:start w:val="1"/>
+      <w:numFmt w:val="bullet"/>
+      <w:lvlText w:val=""/>
+      <w:lvlJc w:val="left"/>
+      <w:pPr>
+        <w:tabs>
+          <w:tab w:val="num" w:pos="4320"/>
+        </w:tabs>
+        <w:ind w:left="4320" w:hanging="360"/>
+      </w:pPr>
+      <w:rPr>
+        <w:rFonts w:ascii="Wingdings" w:hAnsi="Wingdings" w:hint="default"/>
+        <w:sz w:val="20"/>
+      </w:rPr>
+    </w:lvl>
+    <w:lvl w:ilvl="6" w:tentative="1">
+      <w:start w:val="1"/>
+      <w:numFmt w:val="bullet"/>
+      <w:lvlText w:val=""/>
+      <w:lvlJc w:val="left"/>
+      <w:pPr>
+        <w:tabs>
+          <w:tab w:val="num" w:pos="5040"/>
+        </w:tabs>
+        <w:ind w:left="5040" w:hanging="360"/>
+      </w:pPr>
+      <w:rPr>
+        <w:rFonts w:ascii="Wingdings" w:hAnsi="Wingdings" w:hint="default"/>
+        <w:sz w:val="20"/>
+      </w:rPr>
+    </w:lvl>
+    <w:lvl w:ilvl="7" w:tentative="1">
+      <w:start w:val="1"/>
+      <w:numFmt w:val="bullet"/>
+      <w:lvlText w:val=""/>
+      <w:lvlJc w:val="left"/>
+      <w:pPr>
+        <w:tabs>
+          <w:tab w:val="num" w:pos="5760"/>
+        </w:tabs>
+        <w:ind w:left="5760" w:hanging="360"/>
+      </w:pPr>
+      <w:rPr>
+        <w:rFonts w:ascii="Wingdings" w:hAnsi="Wingdings" w:hint="default"/>
+        <w:sz w:val="20"/>
+      </w:rPr>
+    </w:lvl>
+    <w:lvl w:ilvl="8" w:tentative="1">
+      <w:start w:val="1"/>
+      <w:numFmt w:val="bullet"/>
+      <w:lvlText w:val=""/>
+      <w:lvlJc w:val="left"/>
+      <w:pPr>
+        <w:tabs>
+          <w:tab w:val="num" w:pos="6480"/>
+        </w:tabs>
+        <w:ind w:left="6480" w:hanging="360"/>
+      </w:pPr>
+      <w:rPr>
+        <w:rFonts w:ascii="Wingdings" w:hAnsi="Wingdings" w:hint="default"/>
+        <w:sz w:val="20"/>
+      </w:rPr>
+    </w:lvl>
+  </w:abstractNum>
+  <w:abstractNum w:abstractNumId="4" w15:restartNumberingAfterBreak="0">
     <w:nsid w:val="60E217A2"/>
     <w:multiLevelType w:val="multilevel"/>
     <w:tmpl w:val="CCDEE926"/>
@@ -1056,7 +3000,156 @@
       </w:pPr>
     </w:lvl>
   </w:abstractNum>
-  <w:abstractNum w:abstractNumId="2" w15:restartNumberingAfterBreak="0">
+  <w:abstractNum w:abstractNumId="5" w15:restartNumberingAfterBreak="0">
+    <w:nsid w:val="66215086"/>
+    <w:multiLevelType w:val="multilevel"/>
+    <w:tmpl w:val="E7765B9E"/>
+    <w:lvl w:ilvl="0">
+      <w:start w:val="1"/>
+      <w:numFmt w:val="bullet"/>
+      <w:lvlText w:val=""/>
+      <w:lvlJc w:val="left"/>
+      <w:pPr>
+        <w:tabs>
+          <w:tab w:val="num" w:pos="720"/>
+        </w:tabs>
+        <w:ind w:left="720" w:hanging="360"/>
+      </w:pPr>
+      <w:rPr>
+        <w:rFonts w:ascii="Symbol" w:hAnsi="Symbol" w:hint="default"/>
+        <w:sz w:val="20"/>
+      </w:rPr>
+    </w:lvl>
+    <w:lvl w:ilvl="1" w:tentative="1">
+      <w:start w:val="1"/>
+      <w:numFmt w:val="bullet"/>
+      <w:lvlText w:val="o"/>
+      <w:lvlJc w:val="left"/>
+      <w:pPr>
+        <w:tabs>
+          <w:tab w:val="num" w:pos="1440"/>
+        </w:tabs>
+        <w:ind w:left="1440" w:hanging="360"/>
+      </w:pPr>
+      <w:rPr>
+        <w:rFonts w:ascii="Courier New" w:hAnsi="Courier New" w:hint="default"/>
+        <w:sz w:val="20"/>
+      </w:rPr>
+    </w:lvl>
+    <w:lvl w:ilvl="2" w:tentative="1">
+      <w:start w:val="1"/>
+      <w:numFmt w:val="bullet"/>
+      <w:lvlText w:val=""/>
+      <w:lvlJc w:val="left"/>
+      <w:pPr>
+        <w:tabs>
+          <w:tab w:val="num" w:pos="2160"/>
+        </w:tabs>
+        <w:ind w:left="2160" w:hanging="360"/>
+      </w:pPr>
+      <w:rPr>
+        <w:rFonts w:ascii="Wingdings" w:hAnsi="Wingdings" w:hint="default"/>
+        <w:sz w:val="20"/>
+      </w:rPr>
+    </w:lvl>
+    <w:lvl w:ilvl="3" w:tentative="1">
+      <w:start w:val="1"/>
+      <w:numFmt w:val="bullet"/>
+      <w:lvlText w:val=""/>
+      <w:lvlJc w:val="left"/>
+      <w:pPr>
+        <w:tabs>
+          <w:tab w:val="num" w:pos="2880"/>
+        </w:tabs>
+        <w:ind w:left="2880" w:hanging="360"/>
+      </w:pPr>
+      <w:rPr>
+        <w:rFonts w:ascii="Wingdings" w:hAnsi="Wingdings" w:hint="default"/>
+        <w:sz w:val="20"/>
+      </w:rPr>
+    </w:lvl>
+    <w:lvl w:ilvl="4" w:tentative="1">
+      <w:start w:val="1"/>
+      <w:numFmt w:val="bullet"/>
+      <w:lvlText w:val=""/>
+      <w:lvlJc w:val="left"/>
+      <w:pPr>
+        <w:tabs>
+          <w:tab w:val="num" w:pos="3600"/>
+        </w:tabs>
+        <w:ind w:left="3600" w:hanging="360"/>
+      </w:pPr>
+      <w:rPr>
+        <w:rFonts w:ascii="Wingdings" w:hAnsi="Wingdings" w:hint="default"/>
+        <w:sz w:val="20"/>
+      </w:rPr>
+    </w:lvl>
+    <w:lvl w:ilvl="5" w:tentative="1">
+      <w:start w:val="1"/>
+      <w:numFmt w:val="bullet"/>
+      <w:lvlText w:val=""/>
+      <w:lvlJc w:val="left"/>
+      <w:pPr>
+        <w:tabs>
+          <w:tab w:val="num" w:pos="4320"/>
+        </w:tabs>
+        <w:ind w:left="4320" w:hanging="360"/>
+      </w:pPr>
+      <w:rPr>
+        <w:rFonts w:ascii="Wingdings" w:hAnsi="Wingdings" w:hint="default"/>
+        <w:sz w:val="20"/>
+      </w:rPr>
+    </w:lvl>
+    <w:lvl w:ilvl="6" w:tentative="1">
+      <w:start w:val="1"/>
+      <w:numFmt w:val="bullet"/>
+      <w:lvlText w:val=""/>
+      <w:lvlJc w:val="left"/>
+      <w:pPr>
+        <w:tabs>
+          <w:tab w:val="num" w:pos="5040"/>
+        </w:tabs>
+        <w:ind w:left="5040" w:hanging="360"/>
+      </w:pPr>
+      <w:rPr>
+        <w:rFonts w:ascii="Wingdings" w:hAnsi="Wingdings" w:hint="default"/>
+        <w:sz w:val="20"/>
+      </w:rPr>
+    </w:lvl>
+    <w:lvl w:ilvl="7" w:tentative="1">
+      <w:start w:val="1"/>
+      <w:numFmt w:val="bullet"/>
+      <w:lvlText w:val=""/>
+      <w:lvlJc w:val="left"/>
+      <w:pPr>
+        <w:tabs>
+          <w:tab w:val="num" w:pos="5760"/>
+        </w:tabs>
+        <w:ind w:left="5760" w:hanging="360"/>
+      </w:pPr>
+      <w:rPr>
+        <w:rFonts w:ascii="Wingdings" w:hAnsi="Wingdings" w:hint="default"/>
+        <w:sz w:val="20"/>
+      </w:rPr>
+    </w:lvl>
+    <w:lvl w:ilvl="8" w:tentative="1">
+      <w:start w:val="1"/>
+      <w:numFmt w:val="bullet"/>
+      <w:lvlText w:val=""/>
+      <w:lvlJc w:val="left"/>
+      <w:pPr>
+        <w:tabs>
+          <w:tab w:val="num" w:pos="6480"/>
+        </w:tabs>
+        <w:ind w:left="6480" w:hanging="360"/>
+      </w:pPr>
+      <w:rPr>
+        <w:rFonts w:ascii="Wingdings" w:hAnsi="Wingdings" w:hint="default"/>
+        <w:sz w:val="20"/>
+      </w:rPr>
+    </w:lvl>
+  </w:abstractNum>
+  <w:abstractNum w:abstractNumId="6" w15:restartNumberingAfterBreak="0">
     <w:nsid w:val="728A5E6C"/>
     <w:multiLevelType w:val="multilevel"/>
     <w:tmpl w:val="42485066"/>
@@ -1169,7 +3262,7 @@
       </w:pPr>
     </w:lvl>
   </w:abstractNum>
-  <w:abstractNum w:abstractNumId="3" w15:restartNumberingAfterBreak="0">
+  <w:abstractNum w:abstractNumId="7" w15:restartNumberingAfterBreak="0">
     <w:nsid w:val="728D4C50"/>
     <w:multiLevelType w:val="multilevel"/>
     <w:tmpl w:val="A50A1A04"/>
@@ -1282,7 +3375,7 @@
       </w:pPr>
     </w:lvl>
   </w:abstractNum>
-  <w:abstractNum w:abstractNumId="4" w15:restartNumberingAfterBreak="0">
+  <w:abstractNum w:abstractNumId="8" w15:restartNumberingAfterBreak="0">
     <w:nsid w:val="75CE3662"/>
     <w:multiLevelType w:val="multilevel"/>
     <w:tmpl w:val="21B0E332"/>
@@ -1395,20 +3488,148 @@
       </w:pPr>
     </w:lvl>
   </w:abstractNum>
+  <w:abstractNum w:abstractNumId="9" w15:restartNumberingAfterBreak="0">
+    <w:nsid w:val="7E0F5520"/>
+    <w:multiLevelType w:val="multilevel"/>
+    <w:tmpl w:val="FC54DE1A"/>
+    <w:lvl w:ilvl="0">
+      <w:start w:val="1"/>
+      <w:numFmt w:val="decimal"/>
+      <w:lvlText w:val="%1."/>
+      <w:lvlJc w:val="left"/>
+      <w:pPr>
+        <w:tabs>
+          <w:tab w:val="num" w:pos="720"/>
+        </w:tabs>
+        <w:ind w:left="720" w:hanging="360"/>
+      </w:pPr>
+    </w:lvl>
+    <w:lvl w:ilvl="1" w:tentative="1">
+      <w:start w:val="1"/>
+      <w:numFmt w:val="decimal"/>
+      <w:lvlText w:val="%2."/>
+      <w:lvlJc w:val="left"/>
+      <w:pPr>
+        <w:tabs>
+          <w:tab w:val="num" w:pos="1440"/>
+        </w:tabs>
+        <w:ind w:left="1440" w:hanging="360"/>
+      </w:pPr>
+    </w:lvl>
+    <w:lvl w:ilvl="2" w:tentative="1">
+      <w:start w:val="1"/>
+      <w:numFmt w:val="decimal"/>
+      <w:lvlText w:val="%3."/>
+      <w:lvlJc w:val="left"/>
+      <w:pPr>
+        <w:tabs>
+          <w:tab w:val="num" w:pos="2160"/>
+        </w:tabs>
+        <w:ind w:left="2160" w:hanging="360"/>
+      </w:pPr>
+    </w:lvl>
+    <w:lvl w:ilvl="3" w:tentative="1">
+      <w:start w:val="1"/>
+      <w:numFmt w:val="decimal"/>
+      <w:lvlText w:val="%4."/>
+      <w:lvlJc w:val="left"/>
+      <w:pPr>
+        <w:tabs>
+          <w:tab w:val="num" w:pos="2880"/>
+        </w:tabs>
+        <w:ind w:left="2880" w:hanging="360"/>
+      </w:pPr>
+    </w:lvl>
+    <w:lvl w:ilvl="4" w:tentative="1">
+      <w:start w:val="1"/>
+      <w:numFmt w:val="decimal"/>
+      <w:lvlText w:val="%5."/>
+      <w:lvlJc w:val="left"/>
+      <w:pPr>
+        <w:tabs>
+          <w:tab w:val="num" w:pos="3600"/>
+        </w:tabs>
+        <w:ind w:left="3600" w:hanging="360"/>
+      </w:pPr>
+    </w:lvl>
+    <w:lvl w:ilvl="5" w:tentative="1">
+      <w:start w:val="1"/>
+      <w:numFmt w:val="decimal"/>
+      <w:lvlText w:val="%6."/>
+      <w:lvlJc w:val="left"/>
+      <w:pPr>
+        <w:tabs>
+          <w:tab w:val="num" w:pos="4320"/>
+        </w:tabs>
+        <w:ind w:left="4320" w:hanging="360"/>
+      </w:pPr>
+    </w:lvl>
+    <w:lvl w:ilvl="6" w:tentative="1">
+      <w:start w:val="1"/>
+      <w:numFmt w:val="decimal"/>
+      <w:lvlText w:val="%7."/>
+      <w:lvlJc w:val="left"/>
+      <w:pPr>
+        <w:tabs>
+          <w:tab w:val="num" w:pos="5040"/>
+        </w:tabs>
+        <w:ind w:left="5040" w:hanging="360"/>
+      </w:pPr>
+    </w:lvl>
+    <w:lvl w:ilvl="7" w:tentative="1">
+      <w:start w:val="1"/>
+      <w:numFmt w:val="decimal"/>
+      <w:lvlText w:val="%8."/>
+      <w:lvlJc w:val="left"/>
+      <w:pPr>
+        <w:tabs>
+          <w:tab w:val="num" w:pos="5760"/>
+        </w:tabs>
+        <w:ind w:left="5760" w:hanging="360"/>
+      </w:pPr>
+    </w:lvl>
+    <w:lvl w:ilvl="8" w:tentative="1">
+      <w:start w:val="1"/>
+      <w:numFmt w:val="decimal"/>
+      <w:lvlText w:val="%9."/>
+      <w:lvlJc w:val="left"/>
+      <w:pPr>
+        <w:tabs>
+          <w:tab w:val="num" w:pos="6480"/>
+        </w:tabs>
+        <w:ind w:left="6480" w:hanging="360"/>
+      </w:pPr>
+    </w:lvl>
+  </w:abstractNum>
   <w:num w:numId="1" w16cid:durableId="1034692179">
+    <w:abstractNumId w:val="8"/>
+  </w:num>
+  <w:num w:numId="2" w16cid:durableId="789251651">
+    <w:abstractNumId w:val="7"/>
+  </w:num>
+  <w:num w:numId="3" w16cid:durableId="1388339465">
+    <w:abstractNumId w:val="1"/>
+  </w:num>
+  <w:num w:numId="4" w16cid:durableId="145904531">
     <w:abstractNumId w:val="4"/>
   </w:num>
-  <w:num w:numId="2" w16cid:durableId="789251651">
+  <w:num w:numId="5" w16cid:durableId="1781099629">
+    <w:abstractNumId w:val="6"/>
+  </w:num>
+  <w:num w:numId="6" w16cid:durableId="544290291">
+    <w:abstractNumId w:val="5"/>
+  </w:num>
+  <w:num w:numId="7" w16cid:durableId="500705051">
     <w:abstractNumId w:val="3"/>
   </w:num>
-  <w:num w:numId="3" w16cid:durableId="1388339465">
+  <w:num w:numId="8" w16cid:durableId="249237112">
+    <w:abstractNumId w:val="9"/>
+  </w:num>
+  <w:num w:numId="9" w16cid:durableId="398211553">
+    <w:abstractNumId w:val="2"/>
+  </w:num>
+  <w:num w:numId="10" w16cid:durableId="2107383229">
     <w:abstractNumId w:val="0"/>
-  </w:num>
-  <w:num w:numId="4" w16cid:durableId="145904531">
-    <w:abstractNumId w:val="1"/>
-  </w:num>
-  <w:num w:numId="5" w16cid:durableId="1781099629">
-    <w:abstractNumId w:val="2"/>
   </w:num>
 </w:numbering>
 </file>

</xml_diff>